<commit_message>
Regenerate canonical identity artifacts [identity-artifacts]
</commit_message>
<xml_diff>
--- a/assets/resume/matthew-mccluster-resume-it-support.docx
+++ b/assets/resume/matthew-mccluster-resume-it-support.docx
@@ -19,7 +19,7 @@
         <w:rPr>
           <w:b/>
         </w:rPr>
-        <w:t>IT Support &amp; Field Technician · Infrastructure Engineer</w:t>
+        <w:t>IT Support · Infrastructure · Field Technology · Technical Operations</w:t>
       </w:r>
     </w:p>
     <w:p>
@@ -37,7 +37,7 @@
     </w:p>
     <w:p>
       <w:r>
-        <w:t>Matthew McCluster is a Connecticut-based IT support technician and infrastructure engineer with 7+ years of hands-on IT and technical support since 2018: desktop, laptop and business-application support at Robert Half, data-center, Cisco networking and Windows and Linux server work at IPC Systems, and staff platform and technical support at F.R.E.E.D.O.M. Inc. He works on site and independently, communicates clearly with non-technical users, and documents what he does. Since 2025 he has also designed and run the platform behind McCluster Corp, from the database and APIs to deployment.</w:t>
+        <w:t>Matthew McCluster is a Southern Connecticut State University Computer Science student and Connecticut-based IT support and infrastructure professional with hands-on technical experience since 2018: desktop, laptop and business-application support at Robert Half, data-center, Cisco networking and Windows/Linux server work at IPC Systems, and staff platform/technical support at F.R.E.E.D.O.M. Inc. He also works with GNSS and fleet telematics, vehicle electrical/embedded diagnostics, cameras and sensors through Whip Equipped LLC, while operating the PostgreSQL/serverless platform behind McCluster Corp.</w:t>
       </w:r>
     </w:p>
     <w:p>
@@ -185,7 +185,7 @@
         <w:t>Working style:</w:t>
       </w:r>
       <w:r>
-        <w:t xml:space="preserve"> On site, independent, clear with non-technical users, documents the work, trains new team members</w:t>
+        <w:t xml:space="preserve"> On site, independent, clear with non-technical users, documents the work and escalates with context</w:t>
       </w:r>
     </w:p>
     <w:p>
@@ -381,7 +381,7 @@
         <w:pStyle w:val="ListBullet"/>
       </w:pPr>
       <w:r>
-        <w:t>DoD-standard data destruction (dBAN) and ISO-standard e-waste handling; instructed new team members.</w:t>
+        <w:t>DoD-standard data destruction (dBAN) and ISO-standard e-waste handling.</w:t>
       </w:r>
     </w:p>
     <w:p>
@@ -447,7 +447,7 @@
         <w:pStyle w:val="Heading2"/>
       </w:pPr>
       <w:r>
-        <w:t>Other experience</w:t>
+        <w:t>Connected mobility &amp; field technology</w:t>
       </w:r>
     </w:p>
     <w:p>
@@ -455,17 +455,17 @@
         <w:rPr>
           <w:b/>
         </w:rPr>
-        <w:t>Owner-Operator</w:t>
+        <w:t>Founder / Automotive Systems &amp; Telematics Operator</w:t>
       </w:r>
       <w:r>
-        <w:t xml:space="preserve"> · Whip Equipped LLC · Acworth, Georgia</w:t>
+        <w:t xml:space="preserve"> · Whip Equipped LLC · Georgia</w:t>
       </w:r>
       <w:r>
         <w:rPr>
           <w:i/>
         </w:rPr>
         <w:br/>
-        <w:t>2024 – September 2026</w:t>
+        <w:t>2024 – Present</w:t>
       </w:r>
     </w:p>
     <w:p>
@@ -473,7 +473,45 @@
         <w:pStyle w:val="ListBullet"/>
       </w:pPr>
       <w:r>
-        <w:t>Founded and organized a parts-licensed automotive dealership; runs sourcing, sales, licensing and compliance.</w:t>
+        <w:t>Deployed GPS and fleet-telematics systems, integrating connected hardware with vehicle power, data and monitoring workflows.</w:t>
+      </w:r>
+    </w:p>
+    <w:p>
+      <w:pPr>
+        <w:pStyle w:val="ListBullet"/>
+      </w:pPr>
+      <w:r>
+        <w:t>Diagnosed electrical and embedded-system faults and worked with immobilizer, vehicle-security, ADAS, camera and sensor-calibration systems.</w:t>
+      </w:r>
+    </w:p>
+    <w:p>
+      <w:pPr>
+        <w:pStyle w:val="ListBullet"/>
+      </w:pPr>
+      <w:r>
+        <w:t>The dealer/parts phase ran through September 2026; current work centers on connected-mobility R&amp;D and motorcycle product/manufacturing readiness.</w:t>
+      </w:r>
+    </w:p>
+    <w:p>
+      <w:pPr>
+        <w:pStyle w:val="Heading2"/>
+      </w:pPr>
+      <w:r>
+        <w:t>Education</w:t>
+      </w:r>
+    </w:p>
+    <w:p>
+      <w:pPr>
+        <w:pStyle w:val="ListBullet"/>
+      </w:pPr>
+      <w:r>
+        <w:rPr>
+          <w:b/>
+        </w:rPr>
+        <w:t>Southern Connecticut State University:</w:t>
+      </w:r>
+      <w:r>
+        <w:t xml:space="preserve"> B.S. Computer Science — enrolled undergraduate, expected May 2030.</w:t>
       </w:r>
     </w:p>
     <w:p>

</xml_diff>

<commit_message>
Regenerate resume and SEO artifacts
</commit_message>
<xml_diff>
--- a/assets/resume/matthew-mccluster-resume-it-support.docx
+++ b/assets/resume/matthew-mccluster-resume-it-support.docx
@@ -307,6 +307,40 @@
         <w:rPr>
           <w:b/>
         </w:rPr>
+        <w:t>Creative Director</w:t>
+      </w:r>
+      <w:r>
+        <w:t xml:space="preserve"> · The WorkPlace · Connecticut · Client project: Onyx Elite LLC</w:t>
+      </w:r>
+      <w:r>
+        <w:rPr>
+          <w:i/>
+        </w:rPr>
+        <w:br/>
+        <w:t>February 2024 – April 2024</w:t>
+      </w:r>
+    </w:p>
+    <w:p>
+      <w:pPr>
+        <w:pStyle w:val="ListBullet"/>
+      </w:pPr>
+      <w:r>
+        <w:t>Led website and digital-experience work for Onyx Elite while directing collaborators and reviewing creative deliverables.</w:t>
+      </w:r>
+    </w:p>
+    <w:p>
+      <w:pPr>
+        <w:pStyle w:val="ListBullet"/>
+      </w:pPr>
+      <w:r>
+        <w:t>Directed photography, videography and content production for event and campaign work.</w:t>
+      </w:r>
+    </w:p>
+    <w:p>
+      <w:r>
+        <w:rPr>
+          <w:b/>
+        </w:rPr>
         <w:t>Infrastructure Engineer</w:t>
       </w:r>
       <w:r>
@@ -455,7 +489,41 @@
         <w:rPr>
           <w:b/>
         </w:rPr>
-        <w:t>Founder / Automotive Systems &amp; Telematics Operator</w:t>
+        <w:t>Research &amp; Development — Telematics &amp; Connected Mobility</w:t>
+      </w:r>
+      <w:r>
+        <w:t xml:space="preserve"> · Whip Equipped LLC · Remote</w:t>
+      </w:r>
+      <w:r>
+        <w:rPr>
+          <w:i/>
+        </w:rPr>
+        <w:br/>
+        <w:t>October 2026 – Present</w:t>
+      </w:r>
+    </w:p>
+    <w:p>
+      <w:pPr>
+        <w:pStyle w:val="ListBullet"/>
+      </w:pPr>
+      <w:r>
+        <w:t>Develops connected-mobility and telematics systems spanning GNSS, vehicle data, sensors and embedded hardware.</w:t>
+      </w:r>
+    </w:p>
+    <w:p>
+      <w:pPr>
+        <w:pStyle w:val="ListBullet"/>
+      </w:pPr>
+      <w:r>
+        <w:t>Current R&amp;D is separate from Whip Equipped's earlier licensed dealer and parts operations.</w:t>
+      </w:r>
+    </w:p>
+    <w:p>
+      <w:r>
+        <w:rPr>
+          <w:b/>
+        </w:rPr>
+        <w:t>Parts Operations</w:t>
       </w:r>
       <w:r>
         <w:t xml:space="preserve"> · Whip Equipped LLC · Georgia</w:t>
@@ -465,7 +533,7 @@
           <w:i/>
         </w:rPr>
         <w:br/>
-        <w:t>2024 – Present</w:t>
+        <w:t>2024 – September 2026</w:t>
       </w:r>
     </w:p>
     <w:p>
@@ -473,7 +541,25 @@
         <w:pStyle w:val="ListBullet"/>
       </w:pPr>
       <w:r>
-        <w:t>Deployed GPS and fleet-telematics systems, integrating connected hardware with vehicle power, data and monitoring workflows.</w:t>
+        <w:t>Managed automotive parts and vehicle-component workflows within the applicable parts-business scope.</w:t>
+      </w:r>
+    </w:p>
+    <w:p>
+      <w:r>
+        <w:rPr>
+          <w:b/>
+        </w:rPr>
+        <w:t>Dealer Operations / Vehicle Acquisition</w:t>
+      </w:r>
+      <w:r>
+        <w:t xml:space="preserve"> · Whip Equipped LLC · Georgia</w:t>
+      </w:r>
+      <w:r>
+        <w:rPr>
+          <w:i/>
+        </w:rPr>
+        <w:br/>
+        <w:t>2024</w:t>
       </w:r>
     </w:p>
     <w:p>
@@ -481,15 +567,7 @@
         <w:pStyle w:val="ListBullet"/>
       </w:pPr>
       <w:r>
-        <w:t>Diagnosed electrical and embedded-system faults and worked with immobilizer, vehicle-security, ADAS, camera and sensor-calibration systems.</w:t>
-      </w:r>
-    </w:p>
-    <w:p>
-      <w:pPr>
-        <w:pStyle w:val="ListBullet"/>
-      </w:pPr>
-      <w:r>
-        <w:t>The dealer/parts phase ran through September 2026; current work centers on connected-mobility R&amp;D and motorcycle product/manufacturing readiness.</w:t>
+        <w:t>Handled vehicle acquisition and dealer operations only during the applicable licensed dealer period.</w:t>
       </w:r>
     </w:p>
     <w:p>

</xml_diff>

<commit_message>
Regenerate résumé and SEO artifacts after Onyx update (#388)
* Align SEO authority test with current Whip R&D title

* Add one-off resume and SEO regeneration workflow

* Regenerate resume and SEO artifacts

* Regenerate resume and SEO artifacts

* Make resume regeneration manual and artifact-only; prohibit CI branch pushes

* Pin regeneration workflow actions to immutable SHAs

---------

Co-authored-by: github-actions[bot] <41898282+github-actions[bot]@users.noreply.github.com>
</commit_message>
<xml_diff>
--- a/assets/resume/matthew-mccluster-resume-it-support.docx
+++ b/assets/resume/matthew-mccluster-resume-it-support.docx
@@ -307,6 +307,40 @@
         <w:rPr>
           <w:b/>
         </w:rPr>
+        <w:t>Creative Director</w:t>
+      </w:r>
+      <w:r>
+        <w:t xml:space="preserve"> · The WorkPlace · Connecticut · Client project: Onyx Elite LLC</w:t>
+      </w:r>
+      <w:r>
+        <w:rPr>
+          <w:i/>
+        </w:rPr>
+        <w:br/>
+        <w:t>February 2024 – April 2024</w:t>
+      </w:r>
+    </w:p>
+    <w:p>
+      <w:pPr>
+        <w:pStyle w:val="ListBullet"/>
+      </w:pPr>
+      <w:r>
+        <w:t>Led website and digital-experience work for Onyx Elite while directing collaborators and reviewing creative deliverables.</w:t>
+      </w:r>
+    </w:p>
+    <w:p>
+      <w:pPr>
+        <w:pStyle w:val="ListBullet"/>
+      </w:pPr>
+      <w:r>
+        <w:t>Directed photography, videography and content production for event and campaign work.</w:t>
+      </w:r>
+    </w:p>
+    <w:p>
+      <w:r>
+        <w:rPr>
+          <w:b/>
+        </w:rPr>
         <w:t>Infrastructure Engineer</w:t>
       </w:r>
       <w:r>
@@ -455,7 +489,41 @@
         <w:rPr>
           <w:b/>
         </w:rPr>
-        <w:t>Founder / Automotive Systems &amp; Telematics Operator</w:t>
+        <w:t>Research &amp; Development — Telematics &amp; Connected Mobility</w:t>
+      </w:r>
+      <w:r>
+        <w:t xml:space="preserve"> · Whip Equipped LLC · Remote</w:t>
+      </w:r>
+      <w:r>
+        <w:rPr>
+          <w:i/>
+        </w:rPr>
+        <w:br/>
+        <w:t>October 2026 – Present</w:t>
+      </w:r>
+    </w:p>
+    <w:p>
+      <w:pPr>
+        <w:pStyle w:val="ListBullet"/>
+      </w:pPr>
+      <w:r>
+        <w:t>Develops connected-mobility and telematics systems spanning GNSS, vehicle data, sensors and embedded hardware.</w:t>
+      </w:r>
+    </w:p>
+    <w:p>
+      <w:pPr>
+        <w:pStyle w:val="ListBullet"/>
+      </w:pPr>
+      <w:r>
+        <w:t>Current R&amp;D is separate from Whip Equipped's earlier licensed dealer and parts operations.</w:t>
+      </w:r>
+    </w:p>
+    <w:p>
+      <w:r>
+        <w:rPr>
+          <w:b/>
+        </w:rPr>
+        <w:t>Parts Operations</w:t>
       </w:r>
       <w:r>
         <w:t xml:space="preserve"> · Whip Equipped LLC · Georgia</w:t>
@@ -465,7 +533,7 @@
           <w:i/>
         </w:rPr>
         <w:br/>
-        <w:t>2024 – Present</w:t>
+        <w:t>2024 – September 2026</w:t>
       </w:r>
     </w:p>
     <w:p>
@@ -473,7 +541,25 @@
         <w:pStyle w:val="ListBullet"/>
       </w:pPr>
       <w:r>
-        <w:t>Deployed GPS and fleet-telematics systems, integrating connected hardware with vehicle power, data and monitoring workflows.</w:t>
+        <w:t>Managed automotive parts and vehicle-component workflows within the applicable parts-business scope.</w:t>
+      </w:r>
+    </w:p>
+    <w:p>
+      <w:r>
+        <w:rPr>
+          <w:b/>
+        </w:rPr>
+        <w:t>Dealer Operations / Vehicle Acquisition</w:t>
+      </w:r>
+      <w:r>
+        <w:t xml:space="preserve"> · Whip Equipped LLC · Georgia</w:t>
+      </w:r>
+      <w:r>
+        <w:rPr>
+          <w:i/>
+        </w:rPr>
+        <w:br/>
+        <w:t>2024</w:t>
       </w:r>
     </w:p>
     <w:p>
@@ -481,15 +567,7 @@
         <w:pStyle w:val="ListBullet"/>
       </w:pPr>
       <w:r>
-        <w:t>Diagnosed electrical and embedded-system faults and worked with immobilizer, vehicle-security, ADAS, camera and sensor-calibration systems.</w:t>
-      </w:r>
-    </w:p>
-    <w:p>
-      <w:pPr>
-        <w:pStyle w:val="ListBullet"/>
-      </w:pPr>
-      <w:r>
-        <w:t>The dealer/parts phase ran through September 2026; current work centers on connected-mobility R&amp;D and motorcycle product/manufacturing readiness.</w:t>
+        <w:t>Handled vehicle acquisition and dealer operations only during the applicable licensed dealer period.</w:t>
       </w:r>
     </w:p>
     <w:p>

</xml_diff>